<commit_message>
feat: apply verified 2026 vacation migration
</commit_message>
<xml_diff>
--- a/output/documents/Dossier_Inspecao_Registo_Tempos_Atlantic_Holiday.docx
+++ b/output/documents/Dossier_Inspecao_Registo_Tempos_Atlantic_Holiday.docx
@@ -8124,7 +8124,7 @@
         <w:spacing w:after="60"/>
       </w:pPr>
       <w:r>
-        <w:t>Correspondência prioritária pelo número de trabalhador e, em alternativa, pelo nome normalizado.</w:t>
+        <w:t>Correspondência prioritária por nome completo normalizado e, em alternativa, pelo número de trabalhador para perfis cujo nome tenha mudado.</w:t>
       </w:r>
     </w:p>
     <w:p>
@@ -8176,14 +8176,14 @@
         <w:tc>
           <w:tcPr>
             <w:tcW w:type="dxa" w:w="9866"/>
-            <w:shd w:fill="FFF7ED"/>
+            <w:shd w:fill="ECFDF5"/>
             <w:tcBorders>
-              <w:top w:val="single" w:sz="8" w:color="B45309"/>
-              <w:left w:val="single" w:sz="8" w:color="B45309"/>
-              <w:bottom w:val="single" w:sz="8" w:color="B45309"/>
-              <w:right w:val="single" w:sz="8" w:color="B45309"/>
-              <w:insideH w:val="single" w:sz="8" w:color="B45309"/>
-              <w:insideV w:val="single" w:sz="8" w:color="B45309"/>
+              <w:top w:val="single" w:sz="8" w:color="0F766E"/>
+              <w:left w:val="single" w:sz="8" w:color="0F766E"/>
+              <w:bottom w:val="single" w:sz="8" w:color="0F766E"/>
+              <w:right w:val="single" w:sz="8" w:color="0F766E"/>
+              <w:insideH w:val="single" w:sz="8" w:color="0F766E"/>
+              <w:insideV w:val="single" w:sz="8" w:color="0F766E"/>
             </w:tcBorders>
             <w:tcMar>
               <w:top w:w="130" w:type="dxa"/>
@@ -8200,7 +8200,7 @@
               <w:rPr>
                 <w:rFonts w:ascii="Arial" w:hAnsi="Arial"/>
                 <w:b/>
-                <w:color w:val="B45309"/>
+                <w:color w:val="0F766E"/>
               </w:rPr>
               <w:t>Estado da execução</w:t>
             </w:r>
@@ -8210,7 +8210,7 @@
               <w:spacing w:after="0"/>
             </w:pPr>
             <w:r>
-              <w:t>A lógica, a cópia de segurança e os testes automáticos estão concluídos. A aplicação aos dados reais e a verificação visual exigem uma sessão autenticada de gestão; não são criadas picagens de assiduidade durante esta migração.</w:t>
+              <w:t>Migração aplicada em produção em 12/09/2026 às 13:58:54 UTC. Foram correspondidos 18 de 18 trabalhadores, sem omissões ou ambiguidades, e validados os períodos e saldos de cada perfil sem falhas. A cópia de segurança contém os 18 perfis e 110 registos anteriores. A operação não criou nem alterou picagens de assiduidade.</w:t>
             </w:r>
           </w:p>
         </w:tc>
@@ -8377,7 +8377,7 @@
                 <w:color w:val="1E293B"/>
                 <w:sz w:val="16"/>
               </w:rPr>
-              <w:t>443 testes de navegador aprovados em 12/09/2026</w:t>
+              <w:t>444 testes de navegador aprovados em 12/09/2026</w:t>
             </w:r>
           </w:p>
         </w:tc>
@@ -8665,7 +8665,7 @@
                 <w:color w:val="1E293B"/>
                 <w:sz w:val="16"/>
               </w:rPr>
-              <w:t>fd775b6 — contacto RGPD no autosserviço; 26a2c17 — segurança do acesso pessoal a tarefas; f69b5ac — nomes completos na atualização de férias</w:t>
+              <w:t>fd775b6 — contacto RGPD no autosserviço; 26a2c17 — segurança do acesso pessoal a tarefas; 008f59e — migração segura e dossier de inspeção</w:t>
             </w:r>
           </w:p>
         </w:tc>

</xml_diff>